<commit_message>
Corrects problem with AddLocs email overwriting main email. Citrix registrant key if exists detected and save to order row. Saves Connection Checklist URL to NotificationStorage
</commit_message>
<xml_diff>
--- a/CUWebinars.Web/App_Data/mergeTemplates/ConnectionInfo2AddLoc.docx
+++ b/CUWebinars.Web/App_Data/mergeTemplates/ConnectionInfo2AddLoc.docx
@@ -1,6 +1,6 @@
 
 <file path=word/document.xml><?xml version="1.0" encoding="utf-8"?>
-<w:document xmlns:wpc="http://schemas.microsoft.com/office/word/2010/wordprocessingCanvas" xmlns:cx="http://schemas.microsoft.com/office/drawing/2014/chartex" xmlns:cx1="http://schemas.microsoft.com/office/drawing/2015/9/8/chartex" xmlns:cx2="http://schemas.microsoft.com/office/drawing/2015/10/21/chartex" xmlns:cx3="http://schemas.microsoft.com/office/drawing/2016/5/9/chartex" xmlns:cx4="http://schemas.microsoft.com/office/drawing/2016/5/10/chartex" xmlns:cx5="http://schemas.microsoft.com/office/drawing/2016/5/11/chartex" xmlns:mc="http://schemas.openxmlformats.org/markup-compatibility/2006" xmlns:o="urn:schemas-microsoft-com:office:office" xmlns:r="http://schemas.openxmlformats.org/officeDocument/2006/relationships" xmlns:m="http://schemas.openxmlformats.org/officeDocument/2006/math" xmlns:v="urn:schemas-microsoft-com:vml" xmlns:wp14="http://schemas.microsoft.com/office/word/2010/wordprocessingDrawing" xmlns:wp="http://schemas.openxmlformats.org/drawingml/2006/wordprocessingDrawing" xmlns:w10="urn:schemas-microsoft-com:office:word" xmlns:w="http://schemas.openxmlformats.org/wordprocessingml/2006/main" xmlns:w14="http://schemas.microsoft.com/office/word/2010/wordml" xmlns:w15="http://schemas.microsoft.com/office/word/2012/wordml" xmlns:w16se="http://schemas.microsoft.com/office/word/2015/wordml/symex" xmlns:wpg="http://schemas.microsoft.com/office/word/2010/wordprocessingGroup" xmlns:wpi="http://schemas.microsoft.com/office/word/2010/wordprocessingInk" xmlns:wne="http://schemas.microsoft.com/office/word/2006/wordml" xmlns:wps="http://schemas.microsoft.com/office/word/2010/wordprocessingShape" mc:Ignorable="w14 w15 w16se wp14">
+<w:document xmlns:wpc="http://schemas.microsoft.com/office/word/2010/wordprocessingCanvas" xmlns:cx="http://schemas.microsoft.com/office/drawing/2014/chartex" xmlns:cx1="http://schemas.microsoft.com/office/drawing/2015/9/8/chartex" xmlns:cx2="http://schemas.microsoft.com/office/drawing/2015/10/21/chartex" xmlns:cx3="http://schemas.microsoft.com/office/drawing/2016/5/9/chartex" xmlns:cx4="http://schemas.microsoft.com/office/drawing/2016/5/10/chartex" xmlns:cx5="http://schemas.microsoft.com/office/drawing/2016/5/11/chartex" xmlns:cx6="http://schemas.microsoft.com/office/drawing/2016/5/12/chartex" xmlns:cx7="http://schemas.microsoft.com/office/drawing/2016/5/13/chartex" xmlns:cx8="http://schemas.microsoft.com/office/drawing/2016/5/14/chartex" xmlns:mc="http://schemas.openxmlformats.org/markup-compatibility/2006" xmlns:o="urn:schemas-microsoft-com:office:office" xmlns:r="http://schemas.openxmlformats.org/officeDocument/2006/relationships" xmlns:m="http://schemas.openxmlformats.org/officeDocument/2006/math" xmlns:v="urn:schemas-microsoft-com:vml" xmlns:wp14="http://schemas.microsoft.com/office/word/2010/wordprocessingDrawing" xmlns:wp="http://schemas.openxmlformats.org/drawingml/2006/wordprocessingDrawing" xmlns:w10="urn:schemas-microsoft-com:office:word" xmlns:w="http://schemas.openxmlformats.org/wordprocessingml/2006/main" xmlns:w14="http://schemas.microsoft.com/office/word/2010/wordml" xmlns:w15="http://schemas.microsoft.com/office/word/2012/wordml" xmlns:w16se="http://schemas.microsoft.com/office/word/2015/wordml/symex" xmlns:wpg="http://schemas.microsoft.com/office/word/2010/wordprocessingGroup" xmlns:wpi="http://schemas.microsoft.com/office/word/2010/wordprocessingInk" xmlns:wne="http://schemas.microsoft.com/office/word/2006/wordml" xmlns:wps="http://schemas.microsoft.com/office/word/2010/wordprocessingShape" mc:Ignorable="w14 w15 w16se wp14">
   <w:body>
     <w:tbl>
       <w:tblPr>
@@ -17,10 +17,10 @@
         <w:tblLook w:val="04A0" w:firstRow="1" w:lastRow="0" w:firstColumn="1" w:lastColumn="0" w:noHBand="0" w:noVBand="1"/>
       </w:tblPr>
       <w:tblGrid>
-        <w:gridCol w:w="262"/>
-        <w:gridCol w:w="6000"/>
-        <w:gridCol w:w="2835"/>
-        <w:gridCol w:w="263"/>
+        <w:gridCol w:w="264"/>
+        <w:gridCol w:w="6242"/>
+        <w:gridCol w:w="2589"/>
+        <w:gridCol w:w="265"/>
       </w:tblGrid>
       <w:tr>
         <w:tc>
@@ -147,7 +147,7 @@
             </w:tblPr>
             <w:tblGrid>
               <w:gridCol w:w="1115"/>
-              <w:gridCol w:w="1504"/>
+              <w:gridCol w:w="1258"/>
             </w:tblGrid>
             <w:tr>
               <w:tc>
@@ -321,14 +321,6 @@
                       <w:szCs w:val="18"/>
                     </w:rPr>
                   </w:pPr>
-                  <w:r>
-                    <w:rPr>
-                      <w:color w:val="7F7F7F" w:themeColor="text1" w:themeTint="80"/>
-                      <w:sz w:val="18"/>
-                      <w:szCs w:val="18"/>
-                    </w:rPr>
-                    <w:t>Status:</w:t>
-                  </w:r>
                 </w:p>
               </w:tc>
               <w:tc>
@@ -344,42 +336,6 @@
                       <w:szCs w:val="18"/>
                     </w:rPr>
                   </w:pPr>
-                  <w:r>
-                    <w:rPr>
-                      <w:sz w:val="18"/>
-                      <w:szCs w:val="18"/>
-                    </w:rPr>
-                    <w:fldChar w:fldCharType="begin"/>
-                  </w:r>
-                  <w:r>
-                    <w:rPr>
-                      <w:sz w:val="18"/>
-                      <w:szCs w:val="18"/>
-                    </w:rPr>
-                    <w:instrText xml:space="preserve"> MERGEFIELD  PaymentStatus  \* MERGEFORMAT </w:instrText>
-                  </w:r>
-                  <w:r>
-                    <w:rPr>
-                      <w:sz w:val="18"/>
-                      <w:szCs w:val="18"/>
-                    </w:rPr>
-                    <w:fldChar w:fldCharType="separate"/>
-                  </w:r>
-                  <w:r>
-                    <w:rPr>
-                      <w:noProof/>
-                      <w:sz w:val="18"/>
-                      <w:szCs w:val="18"/>
-                    </w:rPr>
-                    <w:t>«PaymentStatus»</w:t>
-                  </w:r>
-                  <w:r>
-                    <w:rPr>
-                      <w:sz w:val="18"/>
-                      <w:szCs w:val="18"/>
-                    </w:rPr>
-                    <w:fldChar w:fldCharType="end"/>
-                  </w:r>
                 </w:p>
               </w:tc>
             </w:tr>
@@ -564,28 +520,41 @@
             <w:r>
               <w:t xml:space="preserve"> </w:t>
             </w:r>
-            <w:fldSimple w:instr=" MERGEFIELD  DisplayDate  \* MERGEFORMAT ">
+            <w:r>
+              <w:fldChar w:fldCharType="begin"/>
+            </w:r>
+            <w:r>
+              <w:instrText xml:space="preserve"> MERGEFIELD  DisplayDate  \* MERGEFORMAT </w:instrText>
+            </w:r>
+            <w:r>
+              <w:fldChar w:fldCharType="separate"/>
+            </w:r>
+            <w:r>
+              <w:rPr>
+                <w:noProof/>
+              </w:rPr>
+              <w:t>«DisplayDate»</w:t>
+            </w:r>
+            <w:r>
+              <w:rPr>
+                <w:noProof/>
+              </w:rPr>
+              <w:fldChar w:fldCharType="end"/>
+            </w:r>
+          </w:p>
+          <w:p>
+            <w:r>
+              <w:t>Your Link:</w:t>
+            </w:r>
+            <w:r>
+              <w:t xml:space="preserve"> </w:t>
+            </w:r>
+            <w:fldSimple w:instr=" MERGEFIELD  ClickToJoinAddLocLink  \* MERGEFORMAT ">
               <w:r>
                 <w:rPr>
                   <w:noProof/>
                 </w:rPr>
-                <w:t>«DisplayDate»</w:t>
-              </w:r>
-            </w:fldSimple>
-          </w:p>
-          <w:p>
-            <w:r>
-              <w:t>Your Link:</w:t>
-            </w:r>
-            <w:r>
-              <w:t xml:space="preserve"> </w:t>
-            </w:r>
-            <w:fldSimple w:instr=" MERGEFIELD  ClickToJoinLink  \* MERGEFORMAT ">
-              <w:r>
-                <w:rPr>
-                  <w:noProof/>
-                </w:rPr>
-                <w:t>«ClickToJoinLink»</w:t>
+                <w:t>«ClickToJoinAddLocLink»</w:t>
               </w:r>
             </w:fldSimple>
           </w:p>
@@ -595,27 +564,14 @@
                 <w:noProof/>
               </w:rPr>
             </w:pPr>
-            <w:r>
-              <w:fldChar w:fldCharType="begin"/>
-            </w:r>
-            <w:r>
-              <w:instrText xml:space="preserve"> MERGEFIELD  AddReminder  \* MERGEFORMAT </w:instrText>
-            </w:r>
-            <w:r>
-              <w:fldChar w:fldCharType="separate"/>
-            </w:r>
-            <w:r>
-              <w:rPr>
-                <w:noProof/>
-              </w:rPr>
-              <w:t>«AddReminder»</w:t>
-            </w:r>
-            <w:r>
-              <w:rPr>
-                <w:noProof/>
-              </w:rPr>
-              <w:fldChar w:fldCharType="end"/>
-            </w:r>
+            <w:fldSimple w:instr=" MERGEFIELD  AddReminder  \* MERGEFORMAT ">
+              <w:r>
+                <w:rPr>
+                  <w:noProof/>
+                </w:rPr>
+                <w:t>«AddReminder»</w:t>
+              </w:r>
+            </w:fldSimple>
           </w:p>
           <w:p/>
           <w:p>
@@ -629,103 +585,29 @@
               <w:t xml:space="preserve">1. </w:t>
             </w:r>
             <w:r>
-              <w:t xml:space="preserve">Click the link to join: </w:t>
-            </w:r>
-            <w:r>
-              <w:fldChar w:fldCharType="begin"/>
-            </w:r>
-            <w:r>
-              <w:instrText xml:space="preserve"> MERGEFIELD  ClickToJoinLink  \* MERGEFORMAT </w:instrText>
-            </w:r>
-            <w:r>
-              <w:fldChar w:fldCharType="separate"/>
-            </w:r>
-            <w:r>
-              <w:rPr>
-                <w:noProof/>
-              </w:rPr>
-              <w:t>«ClickToJoinLink»</w:t>
-            </w:r>
-            <w:r>
-              <w:rPr>
-                <w:noProof/>
-              </w:rPr>
-              <w:fldChar w:fldCharType="end"/>
-            </w:r>
-            <w:r>
-              <w:rPr>
-                <w:noProof/>
-              </w:rPr>
-              <w:t>.</w:t>
-            </w:r>
-            <w:r>
-              <w:rPr>
-                <w:noProof/>
-              </w:rPr>
-              <w:t xml:space="preserve"> </w:t>
-            </w:r>
-            <w:r>
-              <w:rPr>
-                <w:noProof/>
-                <w:sz w:val="20"/>
-                <w:szCs w:val="20"/>
-              </w:rPr>
-              <w:t>(Valid for one location only.)</w:t>
-            </w:r>
-            <w:r>
-              <w:rPr>
-                <w:sz w:val="20"/>
-                <w:szCs w:val="20"/>
-              </w:rPr>
-              <w:t xml:space="preserve"> </w:t>
-            </w:r>
-            <w:fldSimple w:instr=" MERGEFIELD  CCCaption  \* MERGEFORMAT ">
+              <w:t xml:space="preserve">Click the link </w:t>
+            </w:r>
+            <w:r>
+              <w:t>10-15 minutes prior to start time</w:t>
+            </w:r>
+            <w:bookmarkStart w:id="1" w:name="_GoBack"/>
+            <w:bookmarkEnd w:id="1"/>
+            <w:r>
+              <w:t xml:space="preserve">: </w:t>
+            </w:r>
+            <w:fldSimple w:instr=" MERGEFIELD  ClickToJoinAddLocLink  \* MERGEFORMAT ">
               <w:r>
                 <w:rPr>
                   <w:noProof/>
                 </w:rPr>
-                <w:t>«CCCaption»</w:t>
+                <w:t>«ClickToJoinAddLocLink»</w:t>
               </w:r>
             </w:fldSimple>
-            <w:fldSimple w:instr=" MERGEFIELD  ExistingAddLocs  \* MERGEFORMAT ">
-              <w:r>
-                <w:rPr>
-                  <w:noProof/>
-                </w:rPr>
-                <w:t>«ExistingAddLocs»</w:t>
-              </w:r>
-            </w:fldSimple>
-            <w:r>
-              <w:t xml:space="preserve"> </w:t>
-            </w:r>
-            <w:r>
-              <w:fldChar w:fldCharType="begin"/>
-            </w:r>
-            <w:r>
-              <w:instrText xml:space="preserve"> MERGEFIELD  AddLocsCost  \* MERGEFORMAT </w:instrText>
-            </w:r>
-            <w:r>
-              <w:fldChar w:fldCharType="separate"/>
-            </w:r>
-            <w:r>
-              <w:rPr>
-                <w:noProof/>
-              </w:rPr>
-              <w:t>«AddLocsCost»</w:t>
-            </w:r>
-            <w:r>
-              <w:rPr>
-                <w:noProof/>
-              </w:rPr>
-              <w:fldChar w:fldCharType="end"/>
-            </w:r>
           </w:p>
           <w:p>
             <w:pPr>
               <w:ind w:left="532" w:hanging="532"/>
             </w:pPr>
-            <w:bookmarkStart w:id="1" w:name="_GoBack"/>
-            <w:bookmarkEnd w:id="1"/>
           </w:p>
           <w:p>
             <w:pPr>
@@ -745,27 +627,14 @@
             <w:pPr>
               <w:ind w:left="532" w:hanging="532"/>
             </w:pPr>
-            <w:r>
-              <w:fldChar w:fldCharType="begin"/>
-            </w:r>
-            <w:r>
-              <w:instrText xml:space="preserve"> MERGEFIELD  PresenterMaterials  \* MERGEFORMAT </w:instrText>
-            </w:r>
-            <w:r>
-              <w:fldChar w:fldCharType="separate"/>
-            </w:r>
-            <w:r>
-              <w:rPr>
-                <w:noProof/>
-              </w:rPr>
-              <w:t>«PresenterMaterials»</w:t>
-            </w:r>
-            <w:r>
-              <w:rPr>
-                <w:noProof/>
-              </w:rPr>
-              <w:fldChar w:fldCharType="end"/>
-            </w:r>
+            <w:fldSimple w:instr=" MERGEFIELD  PresenterMaterials  \* MERGEFORMAT ">
+              <w:r>
+                <w:rPr>
+                  <w:noProof/>
+                </w:rPr>
+                <w:t>«PresenterMaterials»</w:t>
+              </w:r>
+            </w:fldSimple>
           </w:p>
           <w:p>
             <w:pPr>
@@ -1112,27 +981,32 @@
               <w:t xml:space="preserve"> our notifications to use</w:t>
             </w:r>
             <w:r>
-              <w:t xml:space="preserve"> a different </w:t>
-            </w:r>
-            <w:proofErr w:type="spellStart"/>
-            <w:r>
-              <w:t>timezone</w:t>
-            </w:r>
-            <w:proofErr w:type="spellEnd"/>
-            <w:r>
-              <w:t xml:space="preserve"> please</w:t>
+              <w:t xml:space="preserve"> a different timezone please</w:t>
             </w:r>
             <w:r>
               <w:t xml:space="preserve"> </w:t>
             </w:r>
-            <w:fldSimple w:instr=" MERGEFIELD  ChangeTimeZoneLink  \* MERGEFORMAT ">
-              <w:r>
-                <w:rPr>
-                  <w:noProof/>
-                </w:rPr>
-                <w:t>«ChangeTimeZoneLink»</w:t>
-              </w:r>
-            </w:fldSimple>
+            <w:r>
+              <w:fldChar w:fldCharType="begin"/>
+            </w:r>
+            <w:r>
+              <w:instrText xml:space="preserve"> MERGEFIELD  ChangeTimeZoneLink  \* MERGEFORMAT </w:instrText>
+            </w:r>
+            <w:r>
+              <w:fldChar w:fldCharType="separate"/>
+            </w:r>
+            <w:r>
+              <w:rPr>
+                <w:noProof/>
+              </w:rPr>
+              <w:t>«ChangeTimeZoneLink»</w:t>
+            </w:r>
+            <w:r>
+              <w:rPr>
+                <w:noProof/>
+              </w:rPr>
+              <w:fldChar w:fldCharType="end"/>
+            </w:r>
           </w:p>
           <w:p/>
           <w:p>
@@ -1146,14 +1020,27 @@
             <w:r>
               <w:t xml:space="preserve"> (including a chance to test your computer’s readiness) can be viewed at </w:t>
             </w:r>
-            <w:fldSimple w:instr=" MERGEFIELD  DetailedConnectionInfoLink  \* MERGEFORMAT ">
-              <w:r>
-                <w:rPr>
-                  <w:noProof/>
-                </w:rPr>
-                <w:t>«DetailedConnectionInfoLink»</w:t>
-              </w:r>
-            </w:fldSimple>
+            <w:r>
+              <w:fldChar w:fldCharType="begin"/>
+            </w:r>
+            <w:r>
+              <w:instrText xml:space="preserve"> MERGEFIELD  DetailedConnectionInfoLink  \* MERGEFORMAT </w:instrText>
+            </w:r>
+            <w:r>
+              <w:fldChar w:fldCharType="separate"/>
+            </w:r>
+            <w:r>
+              <w:rPr>
+                <w:noProof/>
+              </w:rPr>
+              <w:t>«DetailedConnectionInfoLink»</w:t>
+            </w:r>
+            <w:r>
+              <w:rPr>
+                <w:noProof/>
+              </w:rPr>
+              <w:fldChar w:fldCharType="end"/>
+            </w:r>
             <w:r>
               <w:t xml:space="preserve">. </w:t>
             </w:r>
@@ -1200,7 +1087,7 @@
               <w:tblLook w:val="04A0" w:firstRow="1" w:lastRow="0" w:firstColumn="1" w:lastColumn="0" w:noHBand="0" w:noVBand="1"/>
             </w:tblPr>
             <w:tblGrid>
-              <w:gridCol w:w="8619"/>
+              <w:gridCol w:w="8615"/>
             </w:tblGrid>
             <w:tr>
               <w:tc>
@@ -1222,8 +1109,8 @@
                     <w:tblLook w:val="04A0" w:firstRow="1" w:lastRow="0" w:firstColumn="1" w:lastColumn="0" w:noHBand="0" w:noVBand="1"/>
                   </w:tblPr>
                   <w:tblGrid>
-                    <w:gridCol w:w="4191"/>
-                    <w:gridCol w:w="4202"/>
+                    <w:gridCol w:w="4189"/>
+                    <w:gridCol w:w="4200"/>
                   </w:tblGrid>
                   <w:tr>
                     <w:tc>
@@ -1498,7 +1385,7 @@
 </file>
 
 <file path=word/numbering.xml><?xml version="1.0" encoding="utf-8"?>
-<w:numbering xmlns:wpc="http://schemas.microsoft.com/office/word/2010/wordprocessingCanvas" xmlns:cx="http://schemas.microsoft.com/office/drawing/2014/chartex" xmlns:cx1="http://schemas.microsoft.com/office/drawing/2015/9/8/chartex" xmlns:cx2="http://schemas.microsoft.com/office/drawing/2015/10/21/chartex" xmlns:cx3="http://schemas.microsoft.com/office/drawing/2016/5/9/chartex" xmlns:cx4="http://schemas.microsoft.com/office/drawing/2016/5/10/chartex" xmlns:cx5="http://schemas.microsoft.com/office/drawing/2016/5/11/chartex" xmlns:mc="http://schemas.openxmlformats.org/markup-compatibility/2006" xmlns:o="urn:schemas-microsoft-com:office:office" xmlns:r="http://schemas.openxmlformats.org/officeDocument/2006/relationships" xmlns:m="http://schemas.openxmlformats.org/officeDocument/2006/math" xmlns:v="urn:schemas-microsoft-com:vml" xmlns:wp14="http://schemas.microsoft.com/office/word/2010/wordprocessingDrawing" xmlns:wp="http://schemas.openxmlformats.org/drawingml/2006/wordprocessingDrawing" xmlns:w10="urn:schemas-microsoft-com:office:word" xmlns:w="http://schemas.openxmlformats.org/wordprocessingml/2006/main" xmlns:w14="http://schemas.microsoft.com/office/word/2010/wordml" xmlns:w15="http://schemas.microsoft.com/office/word/2012/wordml" xmlns:w16se="http://schemas.microsoft.com/office/word/2015/wordml/symex" xmlns:wpg="http://schemas.microsoft.com/office/word/2010/wordprocessingGroup" xmlns:wpi="http://schemas.microsoft.com/office/word/2010/wordprocessingInk" xmlns:wne="http://schemas.microsoft.com/office/word/2006/wordml" xmlns:wps="http://schemas.microsoft.com/office/word/2010/wordprocessingShape" mc:Ignorable="w14 w15 w16se wp14">
+<w:numbering xmlns:wpc="http://schemas.microsoft.com/office/word/2010/wordprocessingCanvas" xmlns:cx="http://schemas.microsoft.com/office/drawing/2014/chartex" xmlns:cx1="http://schemas.microsoft.com/office/drawing/2015/9/8/chartex" xmlns:cx2="http://schemas.microsoft.com/office/drawing/2015/10/21/chartex" xmlns:cx3="http://schemas.microsoft.com/office/drawing/2016/5/9/chartex" xmlns:cx4="http://schemas.microsoft.com/office/drawing/2016/5/10/chartex" xmlns:cx5="http://schemas.microsoft.com/office/drawing/2016/5/11/chartex" xmlns:cx6="http://schemas.microsoft.com/office/drawing/2016/5/12/chartex" xmlns:cx7="http://schemas.microsoft.com/office/drawing/2016/5/13/chartex" xmlns:cx8="http://schemas.microsoft.com/office/drawing/2016/5/14/chartex" xmlns:mc="http://schemas.openxmlformats.org/markup-compatibility/2006" xmlns:o="urn:schemas-microsoft-com:office:office" xmlns:r="http://schemas.openxmlformats.org/officeDocument/2006/relationships" xmlns:m="http://schemas.openxmlformats.org/officeDocument/2006/math" xmlns:v="urn:schemas-microsoft-com:vml" xmlns:wp14="http://schemas.microsoft.com/office/word/2010/wordprocessingDrawing" xmlns:wp="http://schemas.openxmlformats.org/drawingml/2006/wordprocessingDrawing" xmlns:w10="urn:schemas-microsoft-com:office:word" xmlns:w="http://schemas.openxmlformats.org/wordprocessingml/2006/main" xmlns:w14="http://schemas.microsoft.com/office/word/2010/wordml" xmlns:w15="http://schemas.microsoft.com/office/word/2012/wordml" xmlns:w16se="http://schemas.microsoft.com/office/word/2015/wordml/symex" xmlns:wpg="http://schemas.microsoft.com/office/word/2010/wordprocessingGroup" xmlns:wpi="http://schemas.microsoft.com/office/word/2010/wordprocessingInk" xmlns:wne="http://schemas.microsoft.com/office/word/2006/wordml" xmlns:wps="http://schemas.microsoft.com/office/word/2010/wordprocessingShape" mc:Ignorable="w14 w15 w16se wp14">
   <w:abstractNum w:abstractNumId="0" w15:restartNumberingAfterBreak="0">
     <w:nsid w:val="0DED66E9"/>
     <w:multiLevelType w:val="hybridMultilevel"/>
@@ -2666,7 +2553,7 @@
 </file>
 
 <file path=customXml/itemProps1.xml><?xml version="1.0" encoding="utf-8"?>
-<ds:datastoreItem xmlns:ds="http://schemas.openxmlformats.org/officeDocument/2006/customXml" ds:itemID="{69452033-B94C-40E2-B444-45D68F295C56}">
+<ds:datastoreItem xmlns:ds="http://schemas.openxmlformats.org/officeDocument/2006/customXml" ds:itemID="{CEFC41DF-1D55-4887-99AE-7B122636FDE5}">
   <ds:schemaRefs>
     <ds:schemaRef ds:uri="http://schemas.openxmlformats.org/officeDocument/2006/bibliography"/>
   </ds:schemaRefs>

</xml_diff>